<commit_message>
docs: Nightly autonomous update of SAT_Math_and_Geometry_Master_Guide study guide
</commit_message>
<xml_diff>
--- a/study_guides/SAT_Math_and_Geometry_Master_Guide_Study_Guide.docx
+++ b/study_guides/SAT_Math_and_Geometry_Master_Guide_Study_Guide.docx
@@ -55907,7 +55907,7 @@
     </w:p>
     <w:bookmarkEnd w:id="307"/>
     <w:bookmarkEnd w:id="308"/>
-    <w:bookmarkStart w:id="440" w:name="chapter-10-practice-problems"/>
+    <w:bookmarkStart w:id="446" w:name="chapter-10-practice-problems"/>
     <w:p>
       <w:pPr>
         <w:pStyle w:val="Heading1"/>
@@ -76809,9 +76809,2504 @@
         <w:t xml:space="preserve">End of Update — 2026-06-27</w:t>
       </w:r>
     </w:p>
+    <w:p>
+      <w:r>
+        <w:pict>
+          <v:rect style="width:0;height:1.5pt" o:hralign="center" o:hrstd="t" o:hr="t"/>
+        </w:pict>
+      </w:r>
+    </w:p>
     <w:bookmarkEnd w:id="438"/>
     <w:bookmarkEnd w:id="439"/>
+    <w:bookmarkStart w:id="445" w:name="update-2026-06-28---new-concepts"/>
+    <w:p>
+      <w:pPr>
+        <w:pStyle w:val="Heading2"/>
+      </w:pPr>
+      <w:r>
+        <w:t xml:space="preserve">📅 Update: 2026-06-28 - New Concepts</w:t>
+      </w:r>
+    </w:p>
+    <w:bookmarkStart w:id="440" w:name="geometry-trigonometry"/>
+    <w:p>
+      <w:pPr>
+        <w:pStyle w:val="Heading3"/>
+      </w:pPr>
+      <w:r>
+        <w:t xml:space="preserve">📐 Geometry &amp; Trigonometry</w:t>
+      </w:r>
+    </w:p>
+    <w:p>
+      <w:pPr>
+        <w:pStyle w:val="FirstParagraph"/>
+      </w:pPr>
+      <w:r>
+        <w:rPr>
+          <w:b/>
+          <w:bCs/>
+        </w:rPr>
+        <w:t xml:space="preserve">Triangles – Core Relationships:</w:t>
+      </w:r>
+      <w:r>
+        <w:t xml:space="preserve"> </w:t>
+      </w:r>
+      <w:r>
+        <w:t xml:space="preserve">-</w:t>
+      </w:r>
+      <w:r>
+        <w:t xml:space="preserve"> </w:t>
+      </w:r>
+      <w:r>
+        <w:rPr>
+          <w:b/>
+          <w:bCs/>
+        </w:rPr>
+        <w:t xml:space="preserve">Angle Sum:</w:t>
+      </w:r>
+      <w:r>
+        <w:t xml:space="preserve"> </w:t>
+      </w:r>
+      <w:r>
+        <w:t xml:space="preserve">All three internal angles of a triangle sum to 180°.</w:t>
+      </w:r>
+      <w:r>
+        <w:t xml:space="preserve"> </w:t>
+      </w:r>
+      <w:r>
+        <w:t xml:space="preserve">-</w:t>
+      </w:r>
+      <w:r>
+        <w:t xml:space="preserve"> </w:t>
+      </w:r>
+      <w:r>
+        <w:rPr>
+          <w:b/>
+          <w:bCs/>
+        </w:rPr>
+        <w:t xml:space="preserve">Exterior Angle Theorem:</w:t>
+      </w:r>
+      <w:r>
+        <w:t xml:space="preserve"> </w:t>
+      </w:r>
+      <w:r>
+        <w:t xml:space="preserve">An exterior angle equals the sum of the two remote interior angles. Each exterior angle forms a linear pair (180°) with its corresponding interior angle. The sum of all exterior angles (one per vertex) is always 360°.</w:t>
+      </w:r>
+      <w:r>
+        <w:t xml:space="preserve"> </w:t>
+      </w:r>
+      <w:r>
+        <w:t xml:space="preserve">-</w:t>
+      </w:r>
+      <w:r>
+        <w:t xml:space="preserve"> </w:t>
+      </w:r>
+      <w:r>
+        <w:rPr>
+          <w:b/>
+          <w:bCs/>
+        </w:rPr>
+        <w:t xml:space="preserve">Triangle Inequality:</w:t>
+      </w:r>
+      <w:r>
+        <w:t xml:space="preserve"> </w:t>
+      </w:r>
+      <w:r>
+        <w:t xml:space="preserve">The third side must be greater than the positive difference of the other two sides AND less than their sum.</w:t>
+      </w:r>
+      <w:r>
+        <w:t xml:space="preserve"> </w:t>
+      </w:r>
+      <w:r>
+        <w:t xml:space="preserve">-</w:t>
+      </w:r>
+      <w:r>
+        <w:t xml:space="preserve"> </w:t>
+      </w:r>
+      <w:r>
+        <w:rPr>
+          <w:b/>
+          <w:bCs/>
+        </w:rPr>
+        <w:t xml:space="preserve">Side-Angle Relationship:</w:t>
+      </w:r>
+      <w:r>
+        <w:t xml:space="preserve"> </w:t>
+      </w:r>
+      <w:r>
+        <w:t xml:space="preserve">The longest side is opposite the largest angle; the shortest side is opposite the smallest angle.</w:t>
+      </w:r>
+    </w:p>
+    <w:p>
+      <w:pPr>
+        <w:pStyle w:val="BodyText"/>
+      </w:pPr>
+      <w:r>
+        <w:rPr>
+          <w:b/>
+          <w:bCs/>
+        </w:rPr>
+        <w:t xml:space="preserve">Right Triangles:</w:t>
+      </w:r>
+      <w:r>
+        <w:t xml:space="preserve"> </w:t>
+      </w:r>
+      <w:r>
+        <w:t xml:space="preserve">- The</w:t>
+      </w:r>
+      <w:r>
+        <w:t xml:space="preserve"> </w:t>
+      </w:r>
+      <w:r>
+        <w:rPr>
+          <w:b/>
+          <w:bCs/>
+        </w:rPr>
+        <w:t xml:space="preserve">hypotenuse</w:t>
+      </w:r>
+      <w:r>
+        <w:t xml:space="preserve"> </w:t>
+      </w:r>
+      <w:r>
+        <w:t xml:space="preserve">is the side opposite the 90° angle; the other two sides are</w:t>
+      </w:r>
+      <w:r>
+        <w:t xml:space="preserve"> </w:t>
+      </w:r>
+      <w:r>
+        <w:rPr>
+          <w:b/>
+          <w:bCs/>
+        </w:rPr>
+        <w:t xml:space="preserve">legs</w:t>
+      </w:r>
+      <w:r>
+        <w:t xml:space="preserve">.</w:t>
+      </w:r>
+      <w:r>
+        <w:t xml:space="preserve"> </w:t>
+      </w:r>
+      <w:r>
+        <w:t xml:space="preserve">-</w:t>
+      </w:r>
+      <w:r>
+        <w:t xml:space="preserve"> </w:t>
+      </w:r>
+      <w:r>
+        <w:rPr>
+          <w:b/>
+          <w:bCs/>
+        </w:rPr>
+        <w:t xml:space="preserve">Pythagorean Theorem:</w:t>
+      </w:r>
+      <w:r>
+        <w:t xml:space="preserve"> </w:t>
+      </w:r>
+      <w:r>
+        <w:t xml:space="preserve">a² + b² = c² (only applies to right triangles).</w:t>
+      </w:r>
+      <w:r>
+        <w:t xml:space="preserve"> </w:t>
+      </w:r>
+      <w:r>
+        <w:t xml:space="preserve">-</w:t>
+      </w:r>
+      <w:r>
+        <w:t xml:space="preserve"> </w:t>
+      </w:r>
+      <w:r>
+        <w:rPr>
+          <w:b/>
+          <w:bCs/>
+        </w:rPr>
+        <w:t xml:space="preserve">Pythagorean Triples</w:t>
+      </w:r>
+      <w:r>
+        <w:t xml:space="preserve"> </w:t>
+      </w:r>
+      <w:r>
+        <w:t xml:space="preserve">to memorize: 3-4-5, 5-12-13, 8-15-17, 7-24-25, 9-40-41, and their multiples.</w:t>
+      </w:r>
+    </w:p>
+    <w:p>
+      <w:pPr>
+        <w:pStyle w:val="BodyText"/>
+      </w:pPr>
+      <w:r>
+        <w:rPr>
+          <w:b/>
+          <w:bCs/>
+        </w:rPr>
+        <w:t xml:space="preserve">Special Right Triangles:</w:t>
+      </w:r>
+      <w:r>
+        <w:t xml:space="preserve"> </w:t>
+      </w:r>
+      <w:r>
+        <w:t xml:space="preserve">-</w:t>
+      </w:r>
+      <w:r>
+        <w:t xml:space="preserve"> </w:t>
+      </w:r>
+      <w:r>
+        <w:rPr>
+          <w:b/>
+          <w:bCs/>
+        </w:rPr>
+        <w:t xml:space="preserve">Isosceles Right Triangle (45°-45°-90°):</w:t>
+      </w:r>
+      <w:r>
+        <w:t xml:space="preserve"> </w:t>
+      </w:r>
+      <w:r>
+        <w:t xml:space="preserve">Legs are equal; hypotenuse = leg × √2. Area = s²/2.</w:t>
+      </w:r>
+      <w:r>
+        <w:t xml:space="preserve"> </w:t>
+      </w:r>
+      <w:r>
+        <w:t xml:space="preserve">-</w:t>
+      </w:r>
+      <w:r>
+        <w:t xml:space="preserve"> </w:t>
+      </w:r>
+      <w:r>
+        <w:rPr>
+          <w:b/>
+          <w:bCs/>
+        </w:rPr>
+        <w:t xml:space="preserve">30°-60°-90° Triangle:</w:t>
+      </w:r>
+      <w:r>
+        <w:t xml:space="preserve"> </w:t>
+      </w:r>
+      <w:r>
+        <w:t xml:space="preserve">Hypotenuse = 2 × shorter leg; longer leg = shorter leg × √3. Area = (s²√3)/2.</w:t>
+      </w:r>
+      <w:r>
+        <w:t xml:space="preserve"> </w:t>
+      </w:r>
+      <w:r>
+        <w:t xml:space="preserve">-</w:t>
+      </w:r>
+      <w:r>
+        <w:t xml:space="preserve"> </w:t>
+      </w:r>
+      <w:r>
+        <w:rPr>
+          <w:b/>
+          <w:bCs/>
+        </w:rPr>
+        <w:t xml:space="preserve">Equilateral Triangle:</w:t>
+      </w:r>
+      <w:r>
+        <w:t xml:space="preserve"> </w:t>
+      </w:r>
+      <w:r>
+        <w:t xml:space="preserve">All sides congruent, all angles 60°. Area = (s²√3)/4.</w:t>
+      </w:r>
+    </w:p>
+    <w:p>
+      <w:pPr>
+        <w:pStyle w:val="BodyText"/>
+      </w:pPr>
+      <w:r>
+        <w:rPr>
+          <w:b/>
+          <w:bCs/>
+        </w:rPr>
+        <w:t xml:space="preserve">Similar Triangles:</w:t>
+      </w:r>
+      <w:r>
+        <w:t xml:space="preserve"> </w:t>
+      </w:r>
+      <w:r>
+        <w:t xml:space="preserve">All three corresponding angles are congruent, and all three corresponding sides are proportional. Prove similarity using: AA (Angle-Angle), SSS (Side-Side-Side), or SAS (Side-Angle-Side) similarity postulates.</w:t>
+      </w:r>
+    </w:p>
+    <w:p>
+      <w:pPr>
+        <w:pStyle w:val="BodyText"/>
+      </w:pPr>
+      <w:r>
+        <w:rPr>
+          <w:b/>
+          <w:bCs/>
+        </w:rPr>
+        <w:t xml:space="preserve">Trigonometry (Right Triangle Focus):</w:t>
+      </w:r>
+      <w:r>
+        <w:t xml:space="preserve"> </w:t>
+      </w:r>
+      <w:r>
+        <w:t xml:space="preserve">-</w:t>
+      </w:r>
+      <w:r>
+        <w:t xml:space="preserve"> </w:t>
+      </w:r>
+      <w:r>
+        <w:rPr>
+          <w:b/>
+          <w:bCs/>
+        </w:rPr>
+        <w:t xml:space="preserve">SOH-CAH-TOA:</w:t>
+      </w:r>
+      <w:r>
+        <w:t xml:space="preserve"> </w:t>
+      </w:r>
+      <w:r>
+        <w:t xml:space="preserve">- sin(A) = Opposite/Hypotenuse</w:t>
+      </w:r>
+      <w:r>
+        <w:t xml:space="preserve"> </w:t>
+      </w:r>
+      <w:r>
+        <w:t xml:space="preserve">- cos(A) = Adjacent/Hypotenuse</w:t>
+      </w:r>
+      <w:r>
+        <w:t xml:space="preserve"> </w:t>
+      </w:r>
+      <w:r>
+        <w:t xml:space="preserve">- tan(A) = Opposite/Adjacent</w:t>
+      </w:r>
+      <w:r>
+        <w:t xml:space="preserve"> </w:t>
+      </w:r>
+      <w:r>
+        <w:t xml:space="preserve">-</w:t>
+      </w:r>
+      <w:r>
+        <w:t xml:space="preserve"> </w:t>
+      </w:r>
+      <w:r>
+        <w:rPr>
+          <w:b/>
+          <w:bCs/>
+        </w:rPr>
+        <w:t xml:space="preserve">Reciprocal Functions:</w:t>
+      </w:r>
+      <w:r>
+        <w:t xml:space="preserve"> </w:t>
+      </w:r>
+      <w:r>
+        <w:t xml:space="preserve">csc = 1/sin, sec = 1/cos, cot = 1/tan</w:t>
+      </w:r>
+      <w:r>
+        <w:t xml:space="preserve"> </w:t>
+      </w:r>
+      <w:r>
+        <w:t xml:space="preserve">-</w:t>
+      </w:r>
+      <w:r>
+        <w:t xml:space="preserve"> </w:t>
+      </w:r>
+      <w:r>
+        <w:rPr>
+          <w:b/>
+          <w:bCs/>
+        </w:rPr>
+        <w:t xml:space="preserve">Cofunction Identity:</w:t>
+      </w:r>
+      <w:r>
+        <w:t xml:space="preserve"> </w:t>
+      </w:r>
+      <w:r>
+        <w:t xml:space="preserve">sin(x°) = cos(90° − x°). Sine and cosine produce equivalent ratios when evaluated at complementary angles.</w:t>
+      </w:r>
+      <w:r>
+        <w:t xml:space="preserve"> </w:t>
+      </w:r>
+      <w:r>
+        <w:t xml:space="preserve">-</w:t>
+      </w:r>
+      <w:r>
+        <w:t xml:space="preserve"> </w:t>
+      </w:r>
+      <w:r>
+        <w:rPr>
+          <w:b/>
+          <w:bCs/>
+        </w:rPr>
+        <w:t xml:space="preserve">Using Trig to Find Missing Sides/Angles:</w:t>
+      </w:r>
+      <w:r>
+        <w:t xml:space="preserve"> </w:t>
+      </w:r>
+      <w:r>
+        <w:t xml:space="preserve">The triangle MUST be right. Given at least two sides OR one side and an acute angle, use the appropriate trig ratio to solve.</w:t>
+      </w:r>
+    </w:p>
+    <w:p>
+      <w:r>
+        <w:pict>
+          <v:rect style="width:0;height:1.5pt" o:hralign="center" o:hrstd="t" o:hr="t"/>
+        </w:pict>
+      </w:r>
+    </w:p>
     <w:bookmarkEnd w:id="440"/>
+    <w:bookmarkStart w:id="441" w:name="act-math-key-problem-types-from-practice"/>
+    <w:p>
+      <w:pPr>
+        <w:pStyle w:val="Heading3"/>
+      </w:pPr>
+      <w:r>
+        <w:t xml:space="preserve">📊 ACT Math – Key Problem Types from Practice</w:t>
+      </w:r>
+    </w:p>
+    <w:p>
+      <w:pPr>
+        <w:pStyle w:val="FirstParagraph"/>
+      </w:pPr>
+      <w:r>
+        <w:rPr>
+          <w:b/>
+          <w:bCs/>
+        </w:rPr>
+        <w:t xml:space="preserve">Linear Functions &amp; Slope:</w:t>
+      </w:r>
+      <w:r>
+        <w:t xml:space="preserve"> </w:t>
+      </w:r>
+      <w:r>
+        <w:t xml:space="preserve">- Slope formula: m = (y₂ − y₁)/(x₂ − x₁)</w:t>
+      </w:r>
+      <w:r>
+        <w:t xml:space="preserve"> </w:t>
+      </w:r>
+      <w:r>
+        <w:t xml:space="preserve">-</w:t>
+      </w:r>
+      <w:r>
+        <w:t xml:space="preserve"> </w:t>
+      </w:r>
+      <w:r>
+        <w:rPr>
+          <w:b/>
+          <w:bCs/>
+        </w:rPr>
+        <w:t xml:space="preserve">Slope-Intercept Form:</w:t>
+      </w:r>
+      <w:r>
+        <w:t xml:space="preserve"> </w:t>
+      </w:r>
+      <w:r>
+        <w:t xml:space="preserve">y = mx + b (m = slope, b = y-intercept)</w:t>
+      </w:r>
+      <w:r>
+        <w:t xml:space="preserve"> </w:t>
+      </w:r>
+      <w:r>
+        <w:t xml:space="preserve">-</w:t>
+      </w:r>
+      <w:r>
+        <w:t xml:space="preserve"> </w:t>
+      </w:r>
+      <w:r>
+        <w:rPr>
+          <w:b/>
+          <w:bCs/>
+        </w:rPr>
+        <w:t xml:space="preserve">Point-Slope Form:</w:t>
+      </w:r>
+      <w:r>
+        <w:t xml:space="preserve"> </w:t>
+      </w:r>
+      <w:r>
+        <w:t xml:space="preserve">y − y₁ = m(x − x₁)</w:t>
+      </w:r>
+      <w:r>
+        <w:t xml:space="preserve"> </w:t>
+      </w:r>
+      <w:r>
+        <w:t xml:space="preserve">-</w:t>
+      </w:r>
+      <w:r>
+        <w:t xml:space="preserve"> </w:t>
+      </w:r>
+      <w:r>
+        <w:rPr>
+          <w:b/>
+          <w:bCs/>
+        </w:rPr>
+        <w:t xml:space="preserve">Standard Form:</w:t>
+      </w:r>
+      <w:r>
+        <w:t xml:space="preserve"> </w:t>
+      </w:r>
+      <w:r>
+        <w:t xml:space="preserve">Ax + By = C (A should normally be positive integer)</w:t>
+      </w:r>
+      <w:r>
+        <w:t xml:space="preserve"> </w:t>
+      </w:r>
+      <w:r>
+        <w:t xml:space="preserve">-</w:t>
+      </w:r>
+      <w:r>
+        <w:t xml:space="preserve"> </w:t>
+      </w:r>
+      <w:r>
+        <w:rPr>
+          <w:b/>
+          <w:bCs/>
+        </w:rPr>
+        <w:t xml:space="preserve">Parallel Lines:</w:t>
+      </w:r>
+      <w:r>
+        <w:t xml:space="preserve"> </w:t>
+      </w:r>
+      <w:r>
+        <w:t xml:space="preserve">Same slope (m₁ = m₂)</w:t>
+      </w:r>
+      <w:r>
+        <w:t xml:space="preserve"> </w:t>
+      </w:r>
+      <w:r>
+        <w:t xml:space="preserve">-</w:t>
+      </w:r>
+      <w:r>
+        <w:t xml:space="preserve"> </w:t>
+      </w:r>
+      <w:r>
+        <w:rPr>
+          <w:b/>
+          <w:bCs/>
+        </w:rPr>
+        <w:t xml:space="preserve">Perpendicular Lines:</w:t>
+      </w:r>
+      <w:r>
+        <w:t xml:space="preserve"> </w:t>
+      </w:r>
+      <w:r>
+        <w:t xml:space="preserve">Slopes are negative reciprocals (m₁ × m₂ = −1)</w:t>
+      </w:r>
+      <w:r>
+        <w:t xml:space="preserve"> </w:t>
+      </w:r>
+      <w:r>
+        <w:t xml:space="preserve">-</w:t>
+      </w:r>
+      <w:r>
+        <w:t xml:space="preserve"> </w:t>
+      </w:r>
+      <w:r>
+        <w:rPr>
+          <w:b/>
+          <w:bCs/>
+        </w:rPr>
+        <w:t xml:space="preserve">Slope Interpretation:</w:t>
+      </w:r>
+      <w:r>
+        <w:t xml:space="preserve"> </w:t>
+      </w:r>
+      <w:r>
+        <w:t xml:space="preserve">In y = mx + b, the value of the dependent variable changes by m units for each 1-unit increase in the independent variable.</w:t>
+      </w:r>
+    </w:p>
+    <w:p>
+      <w:pPr>
+        <w:pStyle w:val="BodyText"/>
+      </w:pPr>
+      <w:r>
+        <w:rPr>
+          <w:b/>
+          <w:bCs/>
+        </w:rPr>
+        <w:t xml:space="preserve">Systems of Linear Equations:</w:t>
+      </w:r>
+      <w:r>
+        <w:t xml:space="preserve"> </w:t>
+      </w:r>
+      <w:r>
+        <w:t xml:space="preserve">- A system can have 0 solutions (parallel lines), 1 solution (intersecting lines), or infinitely many solutions (identical lines).</w:t>
+      </w:r>
+      <w:r>
+        <w:t xml:space="preserve"> </w:t>
+      </w:r>
+      <w:r>
+        <w:t xml:space="preserve">-</w:t>
+      </w:r>
+      <w:r>
+        <w:t xml:space="preserve"> </w:t>
+      </w:r>
+      <w:r>
+        <w:rPr>
+          <w:b/>
+          <w:bCs/>
+        </w:rPr>
+        <w:t xml:space="preserve">Consistent:</w:t>
+      </w:r>
+      <w:r>
+        <w:t xml:space="preserve"> </w:t>
+      </w:r>
+      <w:r>
+        <w:t xml:space="preserve">At least one solution.</w:t>
+      </w:r>
+      <w:r>
+        <w:t xml:space="preserve"> </w:t>
+      </w:r>
+      <w:r>
+        <w:rPr>
+          <w:b/>
+          <w:bCs/>
+        </w:rPr>
+        <w:t xml:space="preserve">Inconsistent:</w:t>
+      </w:r>
+      <w:r>
+        <w:t xml:space="preserve"> </w:t>
+      </w:r>
+      <w:r>
+        <w:t xml:space="preserve">No solutions.</w:t>
+      </w:r>
+      <w:r>
+        <w:t xml:space="preserve"> </w:t>
+      </w:r>
+      <w:r>
+        <w:t xml:space="preserve">-</w:t>
+      </w:r>
+      <w:r>
+        <w:t xml:space="preserve"> </w:t>
+      </w:r>
+      <w:r>
+        <w:rPr>
+          <w:b/>
+          <w:bCs/>
+        </w:rPr>
+        <w:t xml:space="preserve">Solving Methods:</w:t>
+      </w:r>
+      <w:r>
+        <w:t xml:space="preserve"> </w:t>
+      </w:r>
+      <w:r>
+        <w:t xml:space="preserve">-</w:t>
+      </w:r>
+      <w:r>
+        <w:t xml:space="preserve"> </w:t>
+      </w:r>
+      <w:r>
+        <w:rPr>
+          <w:b/>
+          <w:bCs/>
+        </w:rPr>
+        <w:t xml:space="preserve">Substitution:</w:t>
+      </w:r>
+      <w:r>
+        <w:t xml:space="preserve"> </w:t>
+      </w:r>
+      <w:r>
+        <w:t xml:space="preserve">Best when one variable has a coefficient of 1.</w:t>
+      </w:r>
+      <w:r>
+        <w:t xml:space="preserve"> </w:t>
+      </w:r>
+      <w:r>
+        <w:t xml:space="preserve">-</w:t>
+      </w:r>
+      <w:r>
+        <w:t xml:space="preserve"> </w:t>
+      </w:r>
+      <w:r>
+        <w:rPr>
+          <w:b/>
+          <w:bCs/>
+        </w:rPr>
+        <w:t xml:space="preserve">Elimination:</w:t>
+      </w:r>
+      <w:r>
+        <w:t xml:space="preserve"> </w:t>
+      </w:r>
+      <w:r>
+        <w:t xml:space="preserve">Scale equations to produce opposite coefficients for one variable, then add.</w:t>
+      </w:r>
+      <w:r>
+        <w:t xml:space="preserve"> </w:t>
+      </w:r>
+      <w:r>
+        <w:t xml:space="preserve">-</w:t>
+      </w:r>
+      <w:r>
+        <w:t xml:space="preserve"> </w:t>
+      </w:r>
+      <w:r>
+        <w:rPr>
+          <w:b/>
+          <w:bCs/>
+        </w:rPr>
+        <w:t xml:space="preserve">Classification:</w:t>
+      </w:r>
+      <w:r>
+        <w:t xml:space="preserve"> </w:t>
+      </w:r>
+      <w:r>
+        <w:t xml:space="preserve">Convert to slope-intercept form; compare slopes and y-intercepts.</w:t>
+      </w:r>
+    </w:p>
+    <w:p>
+      <w:pPr>
+        <w:pStyle w:val="BodyText"/>
+      </w:pPr>
+      <w:r>
+        <w:rPr>
+          <w:b/>
+          <w:bCs/>
+        </w:rPr>
+        <w:t xml:space="preserve">Functions:</w:t>
+      </w:r>
+      <w:r>
+        <w:t xml:space="preserve"> </w:t>
+      </w:r>
+      <w:r>
+        <w:t xml:space="preserve">- A function maps each input to exactly one output.</w:t>
+      </w:r>
+      <w:r>
+        <w:t xml:space="preserve"> </w:t>
+      </w:r>
+      <w:r>
+        <w:t xml:space="preserve">-</w:t>
+      </w:r>
+      <w:r>
+        <w:t xml:space="preserve"> </w:t>
+      </w:r>
+      <w:r>
+        <w:rPr>
+          <w:b/>
+          <w:bCs/>
+        </w:rPr>
+        <w:t xml:space="preserve">Domain:</w:t>
+      </w:r>
+      <w:r>
+        <w:t xml:space="preserve"> </w:t>
+      </w:r>
+      <w:r>
+        <w:t xml:space="preserve">Set of all valid x-values.</w:t>
+      </w:r>
+      <w:r>
+        <w:t xml:space="preserve"> </w:t>
+      </w:r>
+      <w:r>
+        <w:t xml:space="preserve">- Evaluate f(a) by substituting a for x in the function expression.</w:t>
+      </w:r>
+      <w:r>
+        <w:t xml:space="preserve"> </w:t>
+      </w:r>
+      <w:r>
+        <w:t xml:space="preserve">-</w:t>
+      </w:r>
+      <w:r>
+        <w:t xml:space="preserve"> </w:t>
+      </w:r>
+      <w:r>
+        <w:rPr>
+          <w:b/>
+          <w:bCs/>
+        </w:rPr>
+        <w:t xml:space="preserve">“</w:t>
+      </w:r>
+      <w:r>
+        <w:rPr>
+          <w:b/>
+          <w:bCs/>
+        </w:rPr>
+        <w:t xml:space="preserve">Wacky Functions</w:t>
+      </w:r>
+      <w:r>
+        <w:rPr>
+          <w:b/>
+          <w:bCs/>
+        </w:rPr>
+        <w:t xml:space="preserve">”</w:t>
+      </w:r>
+      <w:r>
+        <w:rPr>
+          <w:b/>
+          <w:bCs/>
+        </w:rPr>
+        <w:t xml:space="preserve">:</w:t>
+      </w:r>
+      <w:r>
+        <w:t xml:space="preserve"> </w:t>
+      </w:r>
+      <w:r>
+        <w:t xml:space="preserve">Unfamiliar symbols are defined in the problem—just follow the given rule.</w:t>
+      </w:r>
+    </w:p>
+    <w:p>
+      <w:pPr>
+        <w:pStyle w:val="BodyText"/>
+      </w:pPr>
+      <w:r>
+        <w:rPr>
+          <w:b/>
+          <w:bCs/>
+        </w:rPr>
+        <w:t xml:space="preserve">Quadratics:</w:t>
+      </w:r>
+      <w:r>
+        <w:t xml:space="preserve"> </w:t>
+      </w:r>
+      <w:r>
+        <w:t xml:space="preserve">-</w:t>
+      </w:r>
+      <w:r>
+        <w:t xml:space="preserve"> </w:t>
+      </w:r>
+      <w:r>
+        <w:rPr>
+          <w:b/>
+          <w:bCs/>
+        </w:rPr>
+        <w:t xml:space="preserve">Standard Form:</w:t>
+      </w:r>
+      <w:r>
+        <w:t xml:space="preserve"> </w:t>
+      </w:r>
+      <w:r>
+        <w:t xml:space="preserve">y = ax² + bx + c</w:t>
+      </w:r>
+      <w:r>
+        <w:t xml:space="preserve"> </w:t>
+      </w:r>
+      <w:r>
+        <w:t xml:space="preserve">-</w:t>
+      </w:r>
+      <w:r>
+        <w:t xml:space="preserve"> </w:t>
+      </w:r>
+      <w:r>
+        <w:rPr>
+          <w:b/>
+          <w:bCs/>
+        </w:rPr>
+        <w:t xml:space="preserve">Vertex Form:</w:t>
+      </w:r>
+      <w:r>
+        <w:t xml:space="preserve"> </w:t>
+      </w:r>
+      <w:r>
+        <w:t xml:space="preserve">y = a(x − h)² + k (vertex at (h, k))</w:t>
+      </w:r>
+      <w:r>
+        <w:t xml:space="preserve"> </w:t>
+      </w:r>
+      <w:r>
+        <w:t xml:space="preserve">-</w:t>
+      </w:r>
+      <w:r>
+        <w:t xml:space="preserve"> </w:t>
+      </w:r>
+      <w:r>
+        <w:rPr>
+          <w:b/>
+          <w:bCs/>
+        </w:rPr>
+        <w:t xml:space="preserve">Intercept Form:</w:t>
+      </w:r>
+      <w:r>
+        <w:t xml:space="preserve"> </w:t>
+      </w:r>
+      <w:r>
+        <w:t xml:space="preserve">y = a(x − p)(x − q) (x-intercepts at p and q)</w:t>
+      </w:r>
+      <w:r>
+        <w:t xml:space="preserve"> </w:t>
+      </w:r>
+      <w:r>
+        <w:t xml:space="preserve">-</w:t>
+      </w:r>
+      <w:r>
+        <w:t xml:space="preserve"> </w:t>
+      </w:r>
+      <w:r>
+        <w:rPr>
+          <w:b/>
+          <w:bCs/>
+        </w:rPr>
+        <w:t xml:space="preserve">Finding the Vertex:</w:t>
+      </w:r>
+      <w:r>
+        <w:t xml:space="preserve"> </w:t>
+      </w:r>
+      <w:r>
+        <w:t xml:space="preserve">- From standard form: x = −b/(2a), then find y</w:t>
+      </w:r>
+      <w:r>
+        <w:t xml:space="preserve"> </w:t>
+      </w:r>
+      <w:r>
+        <w:t xml:space="preserve">- From intercept form: x = (p + q)/2 (midpoint of intercepts), then find y</w:t>
+      </w:r>
+      <w:r>
+        <w:t xml:space="preserve"> </w:t>
+      </w:r>
+      <w:r>
+        <w:t xml:space="preserve">-</w:t>
+      </w:r>
+      <w:r>
+        <w:t xml:space="preserve"> </w:t>
+      </w:r>
+      <w:r>
+        <w:rPr>
+          <w:b/>
+          <w:bCs/>
+        </w:rPr>
+        <w:t xml:space="preserve">Axis of Symmetry:</w:t>
+      </w:r>
+      <w:r>
+        <w:t xml:space="preserve"> </w:t>
+      </w:r>
+      <w:r>
+        <w:t xml:space="preserve">x = h (vertical line through the vertex)</w:t>
+      </w:r>
+      <w:r>
+        <w:t xml:space="preserve"> </w:t>
+      </w:r>
+      <w:r>
+        <w:t xml:space="preserve">-</w:t>
+      </w:r>
+      <w:r>
+        <w:t xml:space="preserve"> </w:t>
+      </w:r>
+      <w:r>
+        <w:rPr>
+          <w:b/>
+          <w:bCs/>
+        </w:rPr>
+        <w:t xml:space="preserve">Direction:</w:t>
+      </w:r>
+      <w:r>
+        <w:t xml:space="preserve"> </w:t>
+      </w:r>
+      <w:r>
+        <w:t xml:space="preserve">a &gt; 0 → opens up (minimum); a &lt; 0 → opens down (maximum)</w:t>
+      </w:r>
+      <w:r>
+        <w:t xml:space="preserve"> </w:t>
+      </w:r>
+      <w:r>
+        <w:t xml:space="preserve">-</w:t>
+      </w:r>
+      <w:r>
+        <w:t xml:space="preserve"> </w:t>
+      </w:r>
+      <w:r>
+        <w:rPr>
+          <w:b/>
+          <w:bCs/>
+        </w:rPr>
+        <w:t xml:space="preserve">Roots (Zero Product Property):</w:t>
+      </w:r>
+      <w:r>
+        <w:t xml:space="preserve"> </w:t>
+      </w:r>
+      <w:r>
+        <w:t xml:space="preserve">If (x − p)(x − q) = 0, then x = p or x = q</w:t>
+      </w:r>
+      <w:r>
+        <w:t xml:space="preserve"> </w:t>
+      </w:r>
+      <w:r>
+        <w:t xml:space="preserve">-</w:t>
+      </w:r>
+      <w:r>
+        <w:t xml:space="preserve"> </w:t>
+      </w:r>
+      <w:r>
+        <w:rPr>
+          <w:b/>
+          <w:bCs/>
+        </w:rPr>
+        <w:t xml:space="preserve">Converting Forms:</w:t>
+      </w:r>
+      <w:r>
+        <w:t xml:space="preserve"> </w:t>
+      </w:r>
+      <w:r>
+        <w:t xml:space="preserve">Expand vertex/intercept → standard; complete the square or factor standard → vertex/intercept.</w:t>
+      </w:r>
+    </w:p>
+    <w:p>
+      <w:pPr>
+        <w:pStyle w:val="BodyText"/>
+      </w:pPr>
+      <w:r>
+        <w:rPr>
+          <w:b/>
+          <w:bCs/>
+        </w:rPr>
+        <w:t xml:space="preserve">Factoring Quadratics (a ≠ 1):</w:t>
+      </w:r>
+      <w:r>
+        <w:t xml:space="preserve"> </w:t>
+      </w:r>
+      <w:r>
+        <w:t xml:space="preserve">- When the leading coefficient is not 1, use methods like factoring by grouping, the AC method, or trial and error with factor pairs.</w:t>
+      </w:r>
+      <w:r>
+        <w:t xml:space="preserve"> </w:t>
+      </w:r>
+      <w:r>
+        <w:t xml:space="preserve">- Always check for a GCF first.</w:t>
+      </w:r>
+    </w:p>
+    <w:p>
+      <w:pPr>
+        <w:pStyle w:val="BodyText"/>
+      </w:pPr>
+      <w:r>
+        <w:rPr>
+          <w:b/>
+          <w:bCs/>
+        </w:rPr>
+        <w:t xml:space="preserve">Heart of Algebra Drills:</w:t>
+      </w:r>
+      <w:r>
+        <w:t xml:space="preserve"> </w:t>
+      </w:r>
+      <w:r>
+        <w:t xml:space="preserve">-</w:t>
+      </w:r>
+      <w:r>
+        <w:t xml:space="preserve"> </w:t>
+      </w:r>
+      <w:r>
+        <w:rPr>
+          <w:b/>
+          <w:bCs/>
+        </w:rPr>
+        <w:t xml:space="preserve">Inequalities:</w:t>
+      </w:r>
+      <w:r>
+        <w:t xml:space="preserve"> </w:t>
+      </w:r>
+      <w:r>
+        <w:t xml:space="preserve">“</w:t>
+      </w:r>
+      <w:r>
+        <w:t xml:space="preserve">At least</w:t>
+      </w:r>
+      <w:r>
+        <w:t xml:space="preserve">”</w:t>
+      </w:r>
+      <w:r>
+        <w:t xml:space="preserve"> </w:t>
+      </w:r>
+      <w:r>
+        <w:t xml:space="preserve">means ≥;</w:t>
+      </w:r>
+      <w:r>
+        <w:t xml:space="preserve"> </w:t>
+      </w:r>
+      <w:r>
+        <w:t xml:space="preserve">“</w:t>
+      </w:r>
+      <w:r>
+        <w:t xml:space="preserve">no more than</w:t>
+      </w:r>
+      <w:r>
+        <w:t xml:space="preserve">”</w:t>
+      </w:r>
+      <w:r>
+        <w:t xml:space="preserve"> </w:t>
+      </w:r>
+      <w:r>
+        <w:t xml:space="preserve">means ≤. When multiplying/dividing by a negative, flip the inequality sign.</w:t>
+      </w:r>
+      <w:r>
+        <w:t xml:space="preserve"> </w:t>
+      </w:r>
+      <w:r>
+        <w:t xml:space="preserve">-</w:t>
+      </w:r>
+      <w:r>
+        <w:t xml:space="preserve"> </w:t>
+      </w:r>
+      <w:r>
+        <w:rPr>
+          <w:b/>
+          <w:bCs/>
+        </w:rPr>
+        <w:t xml:space="preserve">English to Math Translation:</w:t>
+      </w:r>
+      <w:r>
+        <w:t xml:space="preserve"> </w:t>
+      </w:r>
+      <w:r>
+        <w:t xml:space="preserve">Carefully label variables, identify the relationship (sum, product, difference), and match to answer choices using P.O.E. (Plug Out Eliminate).</w:t>
+      </w:r>
+      <w:r>
+        <w:t xml:space="preserve"> </w:t>
+      </w:r>
+      <w:r>
+        <w:t xml:space="preserve">-</w:t>
+      </w:r>
+      <w:r>
+        <w:t xml:space="preserve"> </w:t>
+      </w:r>
+      <w:r>
+        <w:rPr>
+          <w:b/>
+          <w:bCs/>
+        </w:rPr>
+        <w:t xml:space="preserve">Infinitely Many Solutions:</w:t>
+      </w:r>
+      <w:r>
+        <w:t xml:space="preserve"> </w:t>
+      </w:r>
+      <w:r>
+        <w:t xml:space="preserve">Occurs when two equations represent the same line (same slope AND same y-intercept).</w:t>
+      </w:r>
+    </w:p>
+    <w:p>
+      <w:r>
+        <w:pict>
+          <v:rect style="width:0;height:1.5pt" o:hralign="center" o:hrstd="t" o:hr="t"/>
+        </w:pict>
+      </w:r>
+    </w:p>
+    <w:bookmarkEnd w:id="441"/>
+    <w:bookmarkStart w:id="442" w:name="act-english-grammar-rhetorical-skills"/>
+    <w:p>
+      <w:pPr>
+        <w:pStyle w:val="Heading3"/>
+      </w:pPr>
+      <w:r>
+        <w:t xml:space="preserve">✏️ ACT English – Grammar &amp; Rhetorical Skills</w:t>
+      </w:r>
+    </w:p>
+    <w:p>
+      <w:pPr>
+        <w:pStyle w:val="FirstParagraph"/>
+      </w:pPr>
+      <w:r>
+        <w:rPr>
+          <w:b/>
+          <w:bCs/>
+        </w:rPr>
+        <w:t xml:space="preserve">Punctuation Rules:</w:t>
+      </w:r>
+      <w:r>
+        <w:t xml:space="preserve"> </w:t>
+      </w:r>
+      <w:r>
+        <w:t xml:space="preserve">-</w:t>
+      </w:r>
+      <w:r>
+        <w:t xml:space="preserve"> </w:t>
+      </w:r>
+      <w:r>
+        <w:rPr>
+          <w:b/>
+          <w:bCs/>
+        </w:rPr>
+        <w:t xml:space="preserve">Commas:</w:t>
+      </w:r>
+      <w:r>
+        <w:t xml:space="preserve"> </w:t>
+      </w:r>
+      <w:r>
+        <w:t xml:space="preserve">- Separate items in a list (Oxford comma is optional but tested for placement).</w:t>
+      </w:r>
+      <w:r>
+        <w:t xml:space="preserve"> </w:t>
+      </w:r>
+      <w:r>
+        <w:t xml:space="preserve">- After an introductory dependent clause (ICC).</w:t>
+      </w:r>
+      <w:r>
+        <w:t xml:space="preserve"> </w:t>
+      </w:r>
+      <w:r>
+        <w:t xml:space="preserve">- Before a coordinating conjunction (FANBOYS: for, and, nor, but, or, yet, so) joining two independent clauses.</w:t>
+      </w:r>
+      <w:r>
+        <w:t xml:space="preserve"> </w:t>
+      </w:r>
+      <w:r>
+        <w:t xml:space="preserve">- Around nonessential/middle comma clauses (appositives).</w:t>
+      </w:r>
+      <w:r>
+        <w:t xml:space="preserve"> </w:t>
+      </w:r>
+      <w:r>
+        <w:t xml:space="preserve">- Do NOT use a comma to separate a subject from its verb.</w:t>
+      </w:r>
+      <w:r>
+        <w:t xml:space="preserve"> </w:t>
+      </w:r>
+      <w:r>
+        <w:t xml:space="preserve">-</w:t>
+      </w:r>
+      <w:r>
+        <w:t xml:space="preserve"> </w:t>
+      </w:r>
+      <w:r>
+        <w:rPr>
+          <w:b/>
+          <w:bCs/>
+        </w:rPr>
+        <w:t xml:space="preserve">Semicolons:</w:t>
+      </w:r>
+      <w:r>
+        <w:t xml:space="preserve"> </w:t>
+      </w:r>
+      <w:r>
+        <w:t xml:space="preserve">Join two independent clauses without a conjunction; separate list items that themselves contain commas.</w:t>
+      </w:r>
+      <w:r>
+        <w:t xml:space="preserve"> </w:t>
+      </w:r>
+      <w:r>
+        <w:t xml:space="preserve">-</w:t>
+      </w:r>
+      <w:r>
+        <w:t xml:space="preserve"> </w:t>
+      </w:r>
+      <w:r>
+        <w:rPr>
+          <w:b/>
+          <w:bCs/>
+        </w:rPr>
+        <w:t xml:space="preserve">Colons:</w:t>
+      </w:r>
+      <w:r>
+        <w:t xml:space="preserve"> </w:t>
+      </w:r>
+      <w:r>
+        <w:t xml:space="preserve">Must have a complete sentence before the colon; introduces a list or explanation.</w:t>
+      </w:r>
+      <w:r>
+        <w:t xml:space="preserve"> </w:t>
+      </w:r>
+      <w:r>
+        <w:t xml:space="preserve">-</w:t>
+      </w:r>
+      <w:r>
+        <w:t xml:space="preserve"> </w:t>
+      </w:r>
+      <w:r>
+        <w:rPr>
+          <w:b/>
+          <w:bCs/>
+        </w:rPr>
+        <w:t xml:space="preserve">Dashes:</w:t>
+      </w:r>
+      <w:r>
+        <w:t xml:space="preserve"> </w:t>
+      </w:r>
+      <w:r>
+        <w:t xml:space="preserve">Set off nonessential information (like commas) or add emphasis/shocking information.</w:t>
+      </w:r>
+      <w:r>
+        <w:t xml:space="preserve"> </w:t>
+      </w:r>
+      <w:r>
+        <w:t xml:space="preserve">-</w:t>
+      </w:r>
+      <w:r>
+        <w:t xml:space="preserve"> </w:t>
+      </w:r>
+      <w:r>
+        <w:rPr>
+          <w:b/>
+          <w:bCs/>
+        </w:rPr>
+        <w:t xml:space="preserve">Apostrophes:</w:t>
+      </w:r>
+      <w:r>
+        <w:t xml:space="preserve"> </w:t>
+      </w:r>
+      <w:r>
+        <w:t xml:space="preserve">Contractions (it’s = it is) and possession (singular noun’s, plural noun ending in s → just apostrophe).</w:t>
+      </w:r>
+    </w:p>
+    <w:p>
+      <w:pPr>
+        <w:pStyle w:val="BodyText"/>
+      </w:pPr>
+      <w:r>
+        <w:rPr>
+          <w:b/>
+          <w:bCs/>
+        </w:rPr>
+        <w:t xml:space="preserve">Subject-Verb Agreement:</w:t>
+      </w:r>
+      <w:r>
+        <w:t xml:space="preserve"> </w:t>
+      </w:r>
+      <w:r>
+        <w:t xml:space="preserve">- A subject can NEVER be found within a relative clause, a prepositional phrase, or a comma clause.</w:t>
+      </w:r>
+      <w:r>
+        <w:t xml:space="preserve"> </w:t>
+      </w:r>
+      <w:r>
+        <w:t xml:space="preserve">- The subject comes before the verb (except in</w:t>
+      </w:r>
+      <w:r>
+        <w:t xml:space="preserve"> </w:t>
+      </w:r>
+      <w:r>
+        <w:t xml:space="preserve">“</w:t>
+      </w:r>
+      <w:r>
+        <w:t xml:space="preserve">there is/are</w:t>
+      </w:r>
+      <w:r>
+        <w:t xml:space="preserve">”</w:t>
+      </w:r>
+      <w:r>
+        <w:t xml:space="preserve"> </w:t>
+      </w:r>
+      <w:r>
+        <w:t xml:space="preserve">constructions or questions).</w:t>
+      </w:r>
+      <w:r>
+        <w:t xml:space="preserve"> </w:t>
+      </w:r>
+      <w:r>
+        <w:t xml:space="preserve">-</w:t>
+      </w:r>
+      <w:r>
+        <w:t xml:space="preserve"> </w:t>
+      </w:r>
+      <w:r>
+        <w:t xml:space="preserve">“</w:t>
+      </w:r>
+      <w:r>
+        <w:t xml:space="preserve">Each</w:t>
+      </w:r>
+      <w:r>
+        <w:t xml:space="preserve">”</w:t>
+      </w:r>
+      <w:r>
+        <w:t xml:space="preserve"> </w:t>
+      </w:r>
+      <w:r>
+        <w:t xml:space="preserve">and</w:t>
+      </w:r>
+      <w:r>
+        <w:t xml:space="preserve"> </w:t>
+      </w:r>
+      <w:r>
+        <w:t xml:space="preserve">“</w:t>
+      </w:r>
+      <w:r>
+        <w:t xml:space="preserve">every</w:t>
+      </w:r>
+      <w:r>
+        <w:t xml:space="preserve">”</w:t>
+      </w:r>
+      <w:r>
+        <w:t xml:space="preserve"> </w:t>
+      </w:r>
+      <w:r>
+        <w:t xml:space="preserve">are always singular subjects.</w:t>
+      </w:r>
+      <w:r>
+        <w:t xml:space="preserve"> </w:t>
+      </w:r>
+      <w:r>
+        <w:t xml:space="preserve">- Compound subjects (joined by</w:t>
+      </w:r>
+      <w:r>
+        <w:t xml:space="preserve"> </w:t>
+      </w:r>
+      <w:r>
+        <w:t xml:space="preserve">“</w:t>
+      </w:r>
+      <w:r>
+        <w:t xml:space="preserve">and</w:t>
+      </w:r>
+      <w:r>
+        <w:t xml:space="preserve">”</w:t>
+      </w:r>
+      <w:r>
+        <w:t xml:space="preserve">) are plural.</w:t>
+      </w:r>
+    </w:p>
+    <w:p>
+      <w:pPr>
+        <w:pStyle w:val="BodyText"/>
+      </w:pPr>
+      <w:r>
+        <w:rPr>
+          <w:b/>
+          <w:bCs/>
+        </w:rPr>
+        <w:t xml:space="preserve">Verb Tenses:</w:t>
+      </w:r>
+      <w:r>
+        <w:t xml:space="preserve"> </w:t>
+      </w:r>
+      <w:r>
+        <w:t xml:space="preserve">-</w:t>
+      </w:r>
+      <w:r>
+        <w:t xml:space="preserve"> </w:t>
+      </w:r>
+      <w:r>
+        <w:rPr>
+          <w:b/>
+          <w:bCs/>
+        </w:rPr>
+        <w:t xml:space="preserve">Simple Present:</w:t>
+      </w:r>
+      <w:r>
+        <w:t xml:space="preserve"> </w:t>
+      </w:r>
+      <w:r>
+        <w:t xml:space="preserve">General truths, habitual actions.</w:t>
+      </w:r>
+      <w:r>
+        <w:t xml:space="preserve"> </w:t>
+      </w:r>
+      <w:r>
+        <w:t xml:space="preserve">-</w:t>
+      </w:r>
+      <w:r>
+        <w:t xml:space="preserve"> </w:t>
+      </w:r>
+      <w:r>
+        <w:rPr>
+          <w:b/>
+          <w:bCs/>
+        </w:rPr>
+        <w:t xml:space="preserve">Simple Past:</w:t>
+      </w:r>
+      <w:r>
+        <w:t xml:space="preserve"> </w:t>
+      </w:r>
+      <w:r>
+        <w:t xml:space="preserve">Completed actions at a specific past time.</w:t>
+      </w:r>
+      <w:r>
+        <w:t xml:space="preserve"> </w:t>
+      </w:r>
+      <w:r>
+        <w:t xml:space="preserve">-</w:t>
+      </w:r>
+      <w:r>
+        <w:t xml:space="preserve"> </w:t>
+      </w:r>
+      <w:r>
+        <w:rPr>
+          <w:b/>
+          <w:bCs/>
+        </w:rPr>
+        <w:t xml:space="preserve">Present Perfect:</w:t>
+      </w:r>
+      <w:r>
+        <w:t xml:space="preserve"> </w:t>
+      </w:r>
+      <w:r>
+        <w:t xml:space="preserve">Actions starting in the past and continuing to the present (keywords: since, for, yet, already).</w:t>
+      </w:r>
+      <w:r>
+        <w:t xml:space="preserve"> </w:t>
+      </w:r>
+      <w:r>
+        <w:t xml:space="preserve">-</w:t>
+      </w:r>
+      <w:r>
+        <w:t xml:space="preserve"> </w:t>
+      </w:r>
+      <w:r>
+        <w:rPr>
+          <w:b/>
+          <w:bCs/>
+        </w:rPr>
+        <w:t xml:space="preserve">Past Perfect:</w:t>
+      </w:r>
+      <w:r>
+        <w:t xml:space="preserve"> </w:t>
+      </w:r>
+      <w:r>
+        <w:t xml:space="preserve">An action completed before another past action (keywords: before, by the time, already).</w:t>
+      </w:r>
+      <w:r>
+        <w:t xml:space="preserve"> </w:t>
+      </w:r>
+      <w:r>
+        <w:t xml:space="preserve">-</w:t>
+      </w:r>
+      <w:r>
+        <w:t xml:space="preserve"> </w:t>
+      </w:r>
+      <w:r>
+        <w:rPr>
+          <w:b/>
+          <w:bCs/>
+        </w:rPr>
+        <w:t xml:space="preserve">Present Perfect Progressive:</w:t>
+      </w:r>
+      <w:r>
+        <w:t xml:space="preserve"> </w:t>
+      </w:r>
+      <w:r>
+        <w:t xml:space="preserve">Ongoing action from past to present (has/have been + −ing).</w:t>
+      </w:r>
+    </w:p>
+    <w:p>
+      <w:pPr>
+        <w:pStyle w:val="BodyText"/>
+      </w:pPr>
+      <w:r>
+        <w:rPr>
+          <w:b/>
+          <w:bCs/>
+        </w:rPr>
+        <w:t xml:space="preserve">Transitions – Logical Relationships:</w:t>
+      </w:r>
+      <w:r>
+        <w:t xml:space="preserve"> </w:t>
+      </w:r>
+      <w:r>
+        <w:t xml:space="preserve">| Relationship | Common Transitions |</w:t>
+      </w:r>
+      <w:r>
+        <w:t xml:space="preserve"> </w:t>
+      </w:r>
+      <w:r>
+        <w:t xml:space="preserve">|—|—|</w:t>
+      </w:r>
+      <w:r>
+        <w:t xml:space="preserve"> </w:t>
+      </w:r>
+      <w:r>
+        <w:t xml:space="preserve">|</w:t>
+      </w:r>
+      <w:r>
+        <w:t xml:space="preserve"> </w:t>
+      </w:r>
+      <w:r>
+        <w:rPr>
+          <w:b/>
+          <w:bCs/>
+        </w:rPr>
+        <w:t xml:space="preserve">Contrast/Opposition</w:t>
+      </w:r>
+      <w:r>
+        <w:t xml:space="preserve"> </w:t>
+      </w:r>
+      <w:r>
+        <w:t xml:space="preserve">| however, but, yet, on the other hand, in contrast, conversely, whereas, although, nevertheless |</w:t>
+      </w:r>
+      <w:r>
+        <w:t xml:space="preserve"> </w:t>
+      </w:r>
+      <w:r>
+        <w:t xml:space="preserve">|</w:t>
+      </w:r>
+      <w:r>
+        <w:t xml:space="preserve"> </w:t>
+      </w:r>
+      <w:r>
+        <w:rPr>
+          <w:b/>
+          <w:bCs/>
+        </w:rPr>
+        <w:t xml:space="preserve">Addition/Support</w:t>
+      </w:r>
+      <w:r>
+        <w:t xml:space="preserve"> </w:t>
+      </w:r>
+      <w:r>
+        <w:t xml:space="preserve">| furthermore, moreover, additionally, in addition, also, too |</w:t>
+      </w:r>
+      <w:r>
+        <w:t xml:space="preserve"> </w:t>
+      </w:r>
+      <w:r>
+        <w:t xml:space="preserve">|</w:t>
+      </w:r>
+      <w:r>
+        <w:t xml:space="preserve"> </w:t>
+      </w:r>
+      <w:r>
+        <w:rPr>
+          <w:b/>
+          <w:bCs/>
+        </w:rPr>
+        <w:t xml:space="preserve">Evidence/Example</w:t>
+      </w:r>
+      <w:r>
+        <w:t xml:space="preserve"> </w:t>
+      </w:r>
+      <w:r>
+        <w:t xml:space="preserve">| for example, for instance, indeed, in fact, to illustrate, specifically |</w:t>
+      </w:r>
+      <w:r>
+        <w:t xml:space="preserve"> </w:t>
+      </w:r>
+      <w:r>
+        <w:t xml:space="preserve">|</w:t>
+      </w:r>
+      <w:r>
+        <w:t xml:space="preserve"> </w:t>
+      </w:r>
+      <w:r>
+        <w:rPr>
+          <w:b/>
+          <w:bCs/>
+        </w:rPr>
+        <w:t xml:space="preserve">Cause/Effect</w:t>
+      </w:r>
+      <w:r>
+        <w:t xml:space="preserve"> </w:t>
+      </w:r>
+      <w:r>
+        <w:t xml:space="preserve">| therefore, consequently, thus, as a result, hence, accordingly, because |</w:t>
+      </w:r>
+      <w:r>
+        <w:t xml:space="preserve"> </w:t>
+      </w:r>
+      <w:r>
+        <w:t xml:space="preserve">|</w:t>
+      </w:r>
+      <w:r>
+        <w:t xml:space="preserve"> </w:t>
+      </w:r>
+      <w:r>
+        <w:rPr>
+          <w:b/>
+          <w:bCs/>
+        </w:rPr>
+        <w:t xml:space="preserve">Conclusion/Summary</w:t>
+      </w:r>
+      <w:r>
+        <w:t xml:space="preserve"> </w:t>
+      </w:r>
+      <w:r>
+        <w:t xml:space="preserve">| in conclusion, in summary, to sum up, in short, in other words |</w:t>
+      </w:r>
+      <w:r>
+        <w:t xml:space="preserve"> </w:t>
+      </w:r>
+      <w:r>
+        <w:t xml:space="preserve">|</w:t>
+      </w:r>
+      <w:r>
+        <w:t xml:space="preserve"> </w:t>
+      </w:r>
+      <w:r>
+        <w:rPr>
+          <w:b/>
+          <w:bCs/>
+        </w:rPr>
+        <w:t xml:space="preserve">Sequence/Order</w:t>
+      </w:r>
+      <w:r>
+        <w:t xml:space="preserve"> </w:t>
+      </w:r>
+      <w:r>
+        <w:t xml:space="preserve">| first, next, then, subsequently, finally, before, after, meanwhile |</w:t>
+      </w:r>
+      <w:r>
+        <w:t xml:space="preserve"> </w:t>
+      </w:r>
+      <w:r>
+        <w:t xml:space="preserve">|</w:t>
+      </w:r>
+      <w:r>
+        <w:t xml:space="preserve"> </w:t>
+      </w:r>
+      <w:r>
+        <w:rPr>
+          <w:b/>
+          <w:bCs/>
+        </w:rPr>
+        <w:t xml:space="preserve">Similarity</w:t>
+      </w:r>
+      <w:r>
+        <w:t xml:space="preserve"> </w:t>
+      </w:r>
+      <w:r>
+        <w:t xml:space="preserve">| similarly, likewise, in the same way, by the same token |</w:t>
+      </w:r>
+      <w:r>
+        <w:t xml:space="preserve"> </w:t>
+      </w:r>
+      <w:r>
+        <w:t xml:space="preserve">|</w:t>
+      </w:r>
+      <w:r>
+        <w:t xml:space="preserve"> </w:t>
+      </w:r>
+      <w:r>
+        <w:rPr>
+          <w:b/>
+          <w:bCs/>
+        </w:rPr>
+        <w:t xml:space="preserve">Concession</w:t>
+      </w:r>
+      <w:r>
+        <w:t xml:space="preserve"> </w:t>
+      </w:r>
+      <w:r>
+        <w:t xml:space="preserve">| granted, although, even so, nevertheless, nonetheless |</w:t>
+      </w:r>
+    </w:p>
+    <w:p>
+      <w:pPr>
+        <w:pStyle w:val="BodyText"/>
+      </w:pPr>
+      <w:r>
+        <w:rPr>
+          <w:b/>
+          <w:bCs/>
+        </w:rPr>
+        <w:t xml:space="preserve">Rhetorical Synthesis:</w:t>
+      </w:r>
+      <w:r>
+        <w:t xml:space="preserve"> </w:t>
+      </w:r>
+      <w:r>
+        <w:t xml:space="preserve">1. Read each bullet point and identify it as background info or evidence supporting a claim.</w:t>
+      </w:r>
+      <w:r>
+        <w:t xml:space="preserve"> </w:t>
+      </w:r>
+      <w:r>
+        <w:t xml:space="preserve">2. Read the question header and identify the claim you need to support.</w:t>
+      </w:r>
+      <w:r>
+        <w:t xml:space="preserve"> </w:t>
+      </w:r>
+      <w:r>
+        <w:t xml:space="preserve">3. Select the bullets that directly support that claim.</w:t>
+      </w:r>
+    </w:p>
+    <w:p>
+      <w:pPr>
+        <w:pStyle w:val="BodyText"/>
+      </w:pPr>
+      <w:r>
+        <w:rPr>
+          <w:b/>
+          <w:bCs/>
+        </w:rPr>
+        <w:t xml:space="preserve">Reading Comprehension Strategies:</w:t>
+      </w:r>
+      <w:r>
+        <w:t xml:space="preserve"> </w:t>
+      </w:r>
+      <w:r>
+        <w:t xml:space="preserve">-</w:t>
+      </w:r>
+      <w:r>
+        <w:t xml:space="preserve"> </w:t>
+      </w:r>
+      <w:r>
+        <w:rPr>
+          <w:b/>
+          <w:bCs/>
+        </w:rPr>
+        <w:t xml:space="preserve">Active Reading:</w:t>
+      </w:r>
+      <w:r>
+        <w:t xml:space="preserve"> </w:t>
+      </w:r>
+      <w:r>
+        <w:t xml:space="preserve">Annotate transitional words/phrases and transitional punctuation.</w:t>
+      </w:r>
+      <w:r>
+        <w:t xml:space="preserve"> </w:t>
+      </w:r>
+      <w:r>
+        <w:t xml:space="preserve">-</w:t>
+      </w:r>
+      <w:r>
+        <w:t xml:space="preserve"> </w:t>
+      </w:r>
+      <w:r>
+        <w:rPr>
+          <w:b/>
+          <w:bCs/>
+        </w:rPr>
+        <w:t xml:space="preserve">Foreshadowing:</w:t>
+      </w:r>
+      <w:r>
+        <w:t xml:space="preserve"> </w:t>
+      </w:r>
+      <w:r>
+        <w:t xml:space="preserve">After each transition, predict what’s coming; confirm or revise as you read.</w:t>
+      </w:r>
+      <w:r>
+        <w:t xml:space="preserve"> </w:t>
+      </w:r>
+      <w:r>
+        <w:t xml:space="preserve">-</w:t>
+      </w:r>
+      <w:r>
+        <w:t xml:space="preserve"> </w:t>
+      </w:r>
+      <w:r>
+        <w:rPr>
+          <w:b/>
+          <w:bCs/>
+        </w:rPr>
+        <w:t xml:space="preserve">Inference Questions:</w:t>
+      </w:r>
+      <w:r>
+        <w:t xml:space="preserve"> </w:t>
+      </w:r>
+      <w:r>
+        <w:t xml:space="preserve">Must be supported directly by the text—not assumed.</w:t>
+      </w:r>
+      <w:r>
+        <w:t xml:space="preserve"> </w:t>
+      </w:r>
+      <w:r>
+        <w:t xml:space="preserve">-</w:t>
+      </w:r>
+      <w:r>
+        <w:t xml:space="preserve"> </w:t>
+      </w:r>
+      <w:r>
+        <w:rPr>
+          <w:b/>
+          <w:bCs/>
+        </w:rPr>
+        <w:t xml:space="preserve">“</w:t>
+      </w:r>
+      <w:r>
+        <w:rPr>
+          <w:b/>
+          <w:bCs/>
+        </w:rPr>
+        <w:t xml:space="preserve">Delete</w:t>
+      </w:r>
+      <w:r>
+        <w:rPr>
+          <w:b/>
+          <w:bCs/>
+        </w:rPr>
+        <w:t xml:space="preserve">”</w:t>
+      </w:r>
+      <w:r>
+        <w:rPr>
+          <w:b/>
+          <w:bCs/>
+        </w:rPr>
+        <w:t xml:space="preserve"> </w:t>
+      </w:r>
+      <w:r>
+        <w:rPr>
+          <w:b/>
+          <w:bCs/>
+        </w:rPr>
+        <w:t xml:space="preserve">Questions:</w:t>
+      </w:r>
+      <w:r>
+        <w:t xml:space="preserve"> </w:t>
+      </w:r>
+      <w:r>
+        <w:t xml:space="preserve">Consider what information would be lost if the underlined portion were removed.</w:t>
+      </w:r>
+      <w:r>
+        <w:t xml:space="preserve"> </w:t>
+      </w:r>
+      <w:r>
+        <w:t xml:space="preserve">-</w:t>
+      </w:r>
+      <w:r>
+        <w:t xml:space="preserve"> </w:t>
+      </w:r>
+      <w:r>
+        <w:rPr>
+          <w:b/>
+          <w:bCs/>
+        </w:rPr>
+        <w:t xml:space="preserve">Author’s Purpose/Tone:</w:t>
+      </w:r>
+      <w:r>
+        <w:t xml:space="preserve"> </w:t>
+      </w:r>
+      <w:r>
+        <w:t xml:space="preserve">Look at word choice and overall structure to determine the central point.</w:t>
+      </w:r>
+    </w:p>
+    <w:p>
+      <w:r>
+        <w:pict>
+          <v:rect style="width:0;height:1.5pt" o:hralign="center" o:hrstd="t" o:hr="t"/>
+        </w:pict>
+      </w:r>
+    </w:p>
+    <w:bookmarkEnd w:id="442"/>
+    <w:bookmarkStart w:id="443" w:name="act-reading-passage-analysis-notes"/>
+    <w:p>
+      <w:pPr>
+        <w:pStyle w:val="Heading3"/>
+      </w:pPr>
+      <w:r>
+        <w:t xml:space="preserve">📝 ACT Reading – Passage Analysis Notes</w:t>
+      </w:r>
+    </w:p>
+    <w:p>
+      <w:pPr>
+        <w:pStyle w:val="FirstParagraph"/>
+      </w:pPr>
+      <w:r>
+        <w:rPr>
+          <w:b/>
+          <w:bCs/>
+        </w:rPr>
+        <w:t xml:space="preserve">Literary Narrative (</w:t>
+      </w:r>
+      <w:r>
+        <w:rPr>
+          <w:b/>
+          <w:bCs/>
+        </w:rPr>
+        <w:t xml:space="preserve">“</w:t>
+      </w:r>
+      <w:r>
+        <w:rPr>
+          <w:b/>
+          <w:bCs/>
+        </w:rPr>
+        <w:t xml:space="preserve">Pride</w:t>
+      </w:r>
+      <w:r>
+        <w:rPr>
+          <w:b/>
+          <w:bCs/>
+        </w:rPr>
+        <w:t xml:space="preserve">”</w:t>
+      </w:r>
+      <w:r>
+        <w:rPr>
+          <w:b/>
+          <w:bCs/>
+        </w:rPr>
+        <w:t xml:space="preserve"> </w:t>
+      </w:r>
+      <w:r>
+        <w:rPr>
+          <w:b/>
+          <w:bCs/>
+        </w:rPr>
+        <w:t xml:space="preserve">by Alice Munro):</w:t>
+      </w:r>
+      <w:r>
+        <w:t xml:space="preserve"> </w:t>
+      </w:r>
+      <w:r>
+        <w:t xml:space="preserve">- Focus on character motivation and the consequences of pride.</w:t>
+      </w:r>
+      <w:r>
+        <w:t xml:space="preserve"> </w:t>
+      </w:r>
+      <w:r>
+        <w:t xml:space="preserve">- Horace Jantzen’s downfall: invested improperly in a steam-car scheme; rather than being fired, was given a meaningless demotion (managing a tiny village bank).</w:t>
+      </w:r>
+      <w:r>
+        <w:t xml:space="preserve"> </w:t>
+      </w:r>
+      <w:r>
+        <w:t xml:space="preserve">- His daughter Oneida drove him to work daily—an act of duty masked by pride.</w:t>
+      </w:r>
+      <w:r>
+        <w:t xml:space="preserve"> </w:t>
+      </w:r>
+      <w:r>
+        <w:t xml:space="preserve">- Key theme: Pride can lead to self-destruction and loss of dignity.</w:t>
+      </w:r>
+    </w:p>
+    <w:p>
+      <w:pPr>
+        <w:pStyle w:val="BodyText"/>
+      </w:pPr>
+      <w:r>
+        <w:rPr>
+          <w:b/>
+          <w:bCs/>
+        </w:rPr>
+        <w:t xml:space="preserve">Humanities (</w:t>
+      </w:r>
+      <w:r>
+        <w:rPr>
+          <w:b/>
+          <w:bCs/>
+        </w:rPr>
+        <w:t xml:space="preserve">“</w:t>
+      </w:r>
+      <w:r>
+        <w:rPr>
+          <w:b/>
+          <w:bCs/>
+        </w:rPr>
+        <w:t xml:space="preserve">Albany, 1958</w:t>
+      </w:r>
+      <w:r>
+        <w:rPr>
+          <w:b/>
+          <w:bCs/>
+        </w:rPr>
+        <w:t xml:space="preserve">”</w:t>
+      </w:r>
+      <w:r>
+        <w:rPr>
+          <w:b/>
+          <w:bCs/>
+        </w:rPr>
+        <w:t xml:space="preserve"> </w:t>
+      </w:r>
+      <w:r>
+        <w:rPr>
+          <w:b/>
+          <w:bCs/>
+        </w:rPr>
+        <w:t xml:space="preserve">by Lydia Minatoya):</w:t>
+      </w:r>
+      <w:r>
+        <w:t xml:space="preserve"> </w:t>
+      </w:r>
+      <w:r>
+        <w:t xml:space="preserve">- Central conflict: Mother’s dignity through her sewing work vs. Father’s shame about her serving wealthy clients.</w:t>
+      </w:r>
+      <w:r>
+        <w:t xml:space="preserve"> </w:t>
+      </w:r>
+      <w:r>
+        <w:t xml:space="preserve">- Mother (Okaa-chan) asserts her identity:</w:t>
+      </w:r>
+      <w:r>
+        <w:t xml:space="preserve"> </w:t>
+      </w:r>
+      <w:r>
+        <w:t xml:space="preserve">“</w:t>
+      </w:r>
+      <w:r>
+        <w:t xml:space="preserve">I am a Designer!</w:t>
+      </w:r>
+      <w:r>
+        <w:t xml:space="preserve">”</w:t>
+      </w:r>
+      <w:r>
+        <w:t xml:space="preserve">—her work gives her self-worth regardless of others’ contempt.</w:t>
+      </w:r>
+      <w:r>
+        <w:t xml:space="preserve"> </w:t>
+      </w:r>
+      <w:r>
+        <w:t xml:space="preserve">- The dinner-dances symbolize a lost era of family joy and elegance.</w:t>
+      </w:r>
+    </w:p>
+    <w:p>
+      <w:pPr>
+        <w:pStyle w:val="BodyText"/>
+      </w:pPr>
+      <w:r>
+        <w:rPr>
+          <w:b/>
+          <w:bCs/>
+        </w:rPr>
+        <w:t xml:space="preserve">Hedy Lamarr Passage (History/Science):</w:t>
+      </w:r>
+      <w:r>
+        <w:t xml:space="preserve"> </w:t>
+      </w:r>
+      <w:r>
+        <w:t xml:space="preserve">- Lamarr co-invented</w:t>
+      </w:r>
+      <w:r>
+        <w:t xml:space="preserve"> </w:t>
+      </w:r>
+      <w:r>
+        <w:t xml:space="preserve">“</w:t>
+      </w:r>
+      <w:r>
+        <w:t xml:space="preserve">spread spectrum</w:t>
+      </w:r>
+      <w:r>
+        <w:t xml:space="preserve">”</w:t>
+      </w:r>
+      <w:r>
+        <w:t xml:space="preserve"> </w:t>
+      </w:r>
+      <w:r>
+        <w:t xml:space="preserve">technology (frequency-hopping) to prevent torpedo jamming.</w:t>
+      </w:r>
+      <w:r>
+        <w:t xml:space="preserve"> </w:t>
+      </w:r>
+      <w:r>
+        <w:t xml:space="preserve">- The Navy initially rejected it; decades later it became foundational for wireless communication (cell phones, GPS, Wi-Fi).</w:t>
+      </w:r>
+      <w:r>
+        <w:t xml:space="preserve"> </w:t>
+      </w:r>
+      <w:r>
+        <w:t xml:space="preserve">- Key takeaway: Important inventions may not be recognized in their time.</w:t>
+      </w:r>
+    </w:p>
+    <w:p>
+      <w:r>
+        <w:pict>
+          <v:rect style="width:0;height:1.5pt" o:hralign="center" o:hrstd="t" o:hr="t"/>
+        </w:pict>
+      </w:r>
+    </w:p>
+    <w:bookmarkEnd w:id="443"/>
+    <w:bookmarkStart w:id="444" w:name="Xd37cf3c2627c752452b49783ad785c6b6d03d63"/>
+    <w:p>
+      <w:pPr>
+        <w:pStyle w:val="Heading3"/>
+      </w:pPr>
+      <w:r>
+        <w:t xml:space="preserve">🔢 ACT Math Practice – Problem-Solving Strategies</w:t>
+      </w:r>
+    </w:p>
+    <w:p>
+      <w:pPr>
+        <w:pStyle w:val="FirstParagraph"/>
+      </w:pPr>
+      <w:r>
+        <w:rPr>
+          <w:b/>
+          <w:bCs/>
+        </w:rPr>
+        <w:t xml:space="preserve">General Approach:</w:t>
+      </w:r>
+      <w:r>
+        <w:t xml:space="preserve"> </w:t>
+      </w:r>
+      <w:r>
+        <w:t xml:space="preserve">1.</w:t>
+      </w:r>
+      <w:r>
+        <w:t xml:space="preserve"> </w:t>
+      </w:r>
+      <w:r>
+        <w:rPr>
+          <w:b/>
+          <w:bCs/>
+        </w:rPr>
+        <w:t xml:space="preserve">Label</w:t>
+      </w:r>
+      <w:r>
+        <w:t xml:space="preserve"> </w:t>
+      </w:r>
+      <w:r>
+        <w:t xml:space="preserve">all given information.</w:t>
+      </w:r>
+      <w:r>
+        <w:t xml:space="preserve"> </w:t>
+      </w:r>
+      <w:r>
+        <w:t xml:space="preserve">2.</w:t>
+      </w:r>
+      <w:r>
+        <w:t xml:space="preserve"> </w:t>
+      </w:r>
+      <w:r>
+        <w:rPr>
+          <w:b/>
+          <w:bCs/>
+        </w:rPr>
+        <w:t xml:space="preserve">Identify</w:t>
+      </w:r>
+      <w:r>
+        <w:t xml:space="preserve"> </w:t>
+      </w:r>
+      <w:r>
+        <w:t xml:space="preserve">what the question is asking.</w:t>
+      </w:r>
+      <w:r>
+        <w:t xml:space="preserve"> </w:t>
+      </w:r>
+      <w:r>
+        <w:t xml:space="preserve">3.</w:t>
+      </w:r>
+      <w:r>
+        <w:t xml:space="preserve"> </w:t>
+      </w:r>
+      <w:r>
+        <w:rPr>
+          <w:b/>
+          <w:bCs/>
+        </w:rPr>
+        <w:t xml:space="preserve">Match</w:t>
+      </w:r>
+      <w:r>
+        <w:t xml:space="preserve"> </w:t>
+      </w:r>
+      <w:r>
+        <w:t xml:space="preserve">to a formula or method.</w:t>
+      </w:r>
+      <w:r>
+        <w:t xml:space="preserve"> </w:t>
+      </w:r>
+      <w:r>
+        <w:t xml:space="preserve">4.</w:t>
+      </w:r>
+      <w:r>
+        <w:t xml:space="preserve"> </w:t>
+      </w:r>
+      <w:r>
+        <w:rPr>
+          <w:b/>
+          <w:bCs/>
+        </w:rPr>
+        <w:t xml:space="preserve">Solve</w:t>
+      </w:r>
+      <w:r>
+        <w:t xml:space="preserve"> </w:t>
+      </w:r>
+      <w:r>
+        <w:t xml:space="preserve">carefully.</w:t>
+      </w:r>
+      <w:r>
+        <w:t xml:space="preserve"> </w:t>
+      </w:r>
+      <w:r>
+        <w:t xml:space="preserve">5.</w:t>
+      </w:r>
+      <w:r>
+        <w:t xml:space="preserve"> </w:t>
+      </w:r>
+      <w:r>
+        <w:rPr>
+          <w:b/>
+          <w:bCs/>
+        </w:rPr>
+        <w:t xml:space="preserve">Check</w:t>
+      </w:r>
+      <w:r>
+        <w:t xml:space="preserve"> </w:t>
+      </w:r>
+      <w:r>
+        <w:t xml:space="preserve">using P.O.E. or backsolving.</w:t>
+      </w:r>
+    </w:p>
+    <w:p>
+      <w:pPr>
+        <w:pStyle w:val="BodyText"/>
+      </w:pPr>
+      <w:r>
+        <w:rPr>
+          <w:b/>
+          <w:bCs/>
+        </w:rPr>
+        <w:t xml:space="preserve">Key Formulas to Know:</w:t>
+      </w:r>
+      <w:r>
+        <w:t xml:space="preserve"> </w:t>
+      </w:r>
+      <w:r>
+        <w:t xml:space="preserve">-</w:t>
+      </w:r>
+      <w:r>
+        <w:t xml:space="preserve"> </w:t>
+      </w:r>
+      <w:r>
+        <w:rPr>
+          <w:b/>
+          <w:bCs/>
+        </w:rPr>
+        <w:t xml:space="preserve">Mean (Average):</w:t>
+      </w:r>
+      <w:r>
+        <w:t xml:space="preserve"> </w:t>
+      </w:r>
+      <w:r>
+        <w:t xml:space="preserve">Sum of values / Number of values</w:t>
+      </w:r>
+      <w:r>
+        <w:t xml:space="preserve"> </w:t>
+      </w:r>
+      <w:r>
+        <w:t xml:space="preserve">-</w:t>
+      </w:r>
+      <w:r>
+        <w:t xml:space="preserve"> </w:t>
+      </w:r>
+      <w:r>
+        <w:rPr>
+          <w:b/>
+          <w:bCs/>
+        </w:rPr>
+        <w:t xml:space="preserve">Percent Change:</w:t>
+      </w:r>
+      <w:r>
+        <w:t xml:space="preserve"> </w:t>
+      </w:r>
+      <w:r>
+        <w:t xml:space="preserve">(New − Old)/Old × 100%</w:t>
+      </w:r>
+      <w:r>
+        <w:t xml:space="preserve"> </w:t>
+      </w:r>
+      <w:r>
+        <w:t xml:space="preserve">-</w:t>
+      </w:r>
+      <w:r>
+        <w:t xml:space="preserve"> </w:t>
+      </w:r>
+      <w:r>
+        <w:rPr>
+          <w:b/>
+          <w:bCs/>
+        </w:rPr>
+        <w:t xml:space="preserve">Simple Interest:</w:t>
+      </w:r>
+      <w:r>
+        <w:t xml:space="preserve"> </w:t>
+      </w:r>
+      <w:r>
+        <w:t xml:space="preserve">I = Prt</w:t>
+      </w:r>
+      <w:r>
+        <w:t xml:space="preserve"> </w:t>
+      </w:r>
+      <w:r>
+        <w:t xml:space="preserve">-</w:t>
+      </w:r>
+      <w:r>
+        <w:t xml:space="preserve"> </w:t>
+      </w:r>
+      <w:r>
+        <w:rPr>
+          <w:b/>
+          <w:bCs/>
+        </w:rPr>
+        <w:t xml:space="preserve">Compound Interest:</w:t>
+      </w:r>
+      <w:r>
+        <w:t xml:space="preserve"> </w:t>
+      </w:r>
+      <w:r>
+        <w:t xml:space="preserve">A = P(1 + r/n)^(nt)</w:t>
+      </w:r>
+      <w:r>
+        <w:t xml:space="preserve"> </w:t>
+      </w:r>
+      <w:r>
+        <w:t xml:space="preserve">-</w:t>
+      </w:r>
+      <w:r>
+        <w:t xml:space="preserve"> </w:t>
+      </w:r>
+      <w:r>
+        <w:rPr>
+          <w:b/>
+          <w:bCs/>
+        </w:rPr>
+        <w:t xml:space="preserve">Distance = Rate × Time</w:t>
+      </w:r>
+      <w:r>
+        <w:t xml:space="preserve"> </w:t>
+      </w:r>
+      <w:r>
+        <w:t xml:space="preserve">-</w:t>
+      </w:r>
+      <w:r>
+        <w:t xml:space="preserve"> </w:t>
+      </w:r>
+      <w:r>
+        <w:rPr>
+          <w:b/>
+          <w:bCs/>
+        </w:rPr>
+        <w:t xml:space="preserve">Work/Rate:</w:t>
+      </w:r>
+      <w:r>
+        <w:t xml:space="preserve"> </w:t>
+      </w:r>
+      <w:r>
+        <w:t xml:space="preserve">1/T_total = 1/T₁ + 1/T₂ (for combined work rates)</w:t>
+      </w:r>
+      <w:r>
+        <w:t xml:space="preserve"> </w:t>
+      </w:r>
+      <w:r>
+        <w:t xml:space="preserve">-</w:t>
+      </w:r>
+      <w:r>
+        <w:t xml:space="preserve"> </w:t>
+      </w:r>
+      <w:r>
+        <w:rPr>
+          <w:b/>
+          <w:bCs/>
+        </w:rPr>
+        <w:t xml:space="preserve">Probability:</w:t>
+      </w:r>
+      <w:r>
+        <w:t xml:space="preserve"> </w:t>
+      </w:r>
+      <w:r>
+        <w:t xml:space="preserve">Favorable outcomes / Total outcomes</w:t>
+      </w:r>
+      <w:r>
+        <w:t xml:space="preserve"> </w:t>
+      </w:r>
+      <w:r>
+        <w:t xml:space="preserve">-</w:t>
+      </w:r>
+      <w:r>
+        <w:t xml:space="preserve"> </w:t>
+      </w:r>
+      <w:r>
+        <w:rPr>
+          <w:b/>
+          <w:bCs/>
+        </w:rPr>
+        <w:t xml:space="preserve">Circle Graph Central Angle:</w:t>
+      </w:r>
+      <w:r>
+        <w:t xml:space="preserve"> </w:t>
+      </w:r>
+      <w:r>
+        <w:t xml:space="preserve">(Category % / 100) × 360°</w:t>
+      </w:r>
+    </w:p>
+    <w:p>
+      <w:pPr>
+        <w:pStyle w:val="BodyText"/>
+      </w:pPr>
+      <w:r>
+        <w:rPr>
+          <w:b/>
+          <w:bCs/>
+        </w:rPr>
+        <w:t xml:space="preserve">Mixture Problems:</w:t>
+      </w:r>
+      <w:r>
+        <w:t xml:space="preserve"> </w:t>
+      </w:r>
+      <w:r>
+        <w:t xml:space="preserve">- Set up: (concentration₁)(amount₁) + (concentration₂)(amount₂) = (target concentration)(total amount)</w:t>
+      </w:r>
+    </w:p>
+    <w:p>
+      <w:pPr>
+        <w:pStyle w:val="BodyText"/>
+      </w:pPr>
+      <w:r>
+        <w:rPr>
+          <w:b/>
+          <w:bCs/>
+        </w:rPr>
+        <w:t xml:space="preserve">Rate Problems with Multiple Speeds:</w:t>
+      </w:r>
+      <w:r>
+        <w:t xml:space="preserve"> </w:t>
+      </w:r>
+      <w:r>
+        <w:t xml:space="preserve">- Use a D = R × T chart for each segment of the trip.</w:t>
+      </w:r>
+      <w:r>
+        <w:t xml:space="preserve"> </w:t>
+      </w:r>
+      <w:r>
+        <w:t xml:space="preserve">- Average speed = Total distance / Total time (NOT the average of the speeds).</w:t>
+      </w:r>
+    </w:p>
+    <w:bookmarkEnd w:id="444"/>
+    <w:bookmarkEnd w:id="445"/>
+    <w:bookmarkEnd w:id="446"/>
     <w:sectPr/>
   </w:body>
 </w:document>
@@ -78540,8 +81035,8 @@
 <Error>
   <Code>AccessDenied</Code>
   <Message>Access Denied</Message>
-  <RequestId>MV5KM62S35T7S73Z</RequestId>
-  <HostId>eaM0m4k01zQWanLe8E5Kc9aj8c9NTRqtVlqTEmSqSdOCTImz8UpmEjzaj2T60B7zey/EN7bAmZX4aRPx46lIcMubxyiVJDt+</HostId>
+  <RequestId>FSVBKN6PHQE27GKM</RequestId>
+  <HostId>HXqE+9C67givA3aqCwaYtAISsaPvkAdrW4ksthHozfSwtK1jDAN91ez6VXsnWTeTHqiwtOuv+PCJ9AaZsncvmAuS+qWu0NZ9</HostId>
 </Error>
 </file>
 

</xml_diff>